<commit_message>
Model layer updated Backend
</commit_message>
<xml_diff>
--- a/Prompts.docx
+++ b/Prompts.docx
@@ -3,13 +3,213 @@
 <w:document xmlns:wpc="http://schemas.microsoft.com/office/word/2010/wordprocessingCanvas" xmlns:cx="http://schemas.microsoft.com/office/drawing/2014/chartex" xmlns:cx1="http://schemas.microsoft.com/office/drawing/2015/9/8/chartex" xmlns:cx2="http://schemas.microsoft.com/office/drawing/2015/10/21/chartex" xmlns:cx3="http://schemas.microsoft.com/office/drawing/2016/5/9/chartex" xmlns:cx4="http://schemas.microsoft.com/office/drawing/2016/5/10/chartex" xmlns:cx5="http://schemas.microsoft.com/office/drawing/2016/5/11/chartex" xmlns:cx6="http://schemas.microsoft.com/office/drawing/2016/5/12/chartex" xmlns:cx7="http://schemas.microsoft.com/office/drawing/2016/5/13/chartex" xmlns:cx8="http://schemas.microsoft.com/office/drawing/2016/5/14/chartex" xmlns:mc="http://schemas.openxmlformats.org/markup-compatibility/2006" xmlns:aink="http://schemas.microsoft.com/office/drawing/2016/ink" xmlns:am3d="http://schemas.microsoft.com/office/drawing/2017/model3d" xmlns:o="urn:schemas-microsoft-com:office:office" xmlns:oel="http://schemas.microsoft.com/office/2019/extlst" xmlns:r="http://schemas.openxmlformats.org/officeDocument/2006/relationships" xmlns:m="http://schemas.openxmlformats.org/officeDocument/2006/math" xmlns:v="urn:schemas-microsoft-com:vml" xmlns:wp14="http://schemas.microsoft.com/office/word/2010/wordprocessingDrawing" xmlns:wp="http://schemas.openxmlformats.org/drawingml/2006/wordprocessingDrawing" xmlns:w10="urn:schemas-microsoft-com:office:word" xmlns:w="http://schemas.openxmlformats.org/wordprocessingml/2006/main" xmlns:w14="http://schemas.microsoft.com/office/word/2010/wordml" xmlns:w15="http://schemas.microsoft.com/office/word/2012/wordml" xmlns:w16cex="http://schemas.microsoft.com/office/word/2018/wordml/cex" xmlns:w16cid="http://schemas.microsoft.com/office/word/2016/wordml/cid" xmlns:w16="http://schemas.microsoft.com/office/word/2018/wordml" xmlns:w16du="http://schemas.microsoft.com/office/word/2023/wordml/word16du" xmlns:w16sdtdh="http://schemas.microsoft.com/office/word/2020/wordml/sdtdatahash" xmlns:w16sdtfl="http://schemas.microsoft.com/office/word/2024/wordml/sdtformatlock" xmlns:w16se="http://schemas.microsoft.com/office/word/2015/wordml/symex" xmlns:wpg="http://schemas.microsoft.com/office/word/2010/wordprocessingGroup" xmlns:wpi="http://schemas.microsoft.com/office/word/2010/wordprocessingInk" xmlns:wne="http://schemas.microsoft.com/office/word/2006/wordml" xmlns:wps="http://schemas.microsoft.com/office/word/2010/wordprocessingShape" mc:Ignorable="w14 w15 w16se w16cid w16 w16cex w16sdtdh w16sdtfl w16du wp14">
   <w:body>
     <w:p>
-      <w:r>
-        <w:t>I am planning to make an app like kahoot where multiple users get in a custom room and play game based on MCQs. Now I want to add some extra features where the users who are playing the game must enter an interesting fact an about him. All the users must come with their original name. Now we have all the players with some interesting facts about each themselves After starting the game, each user will get mcqs in such format that the statement will be some interesting fact about one user and the options are some random user names. Rest of the game will be of kahoot format. I want to build this game using Java springboot backend and kotlin jetpack compose frontend, I want it to be an interactive app with good color scheme and gui. I want you to guide me how can I build this app from scratch. Also tell me whole of the procedure as its my first project. If you are giving me code then explain each of the component of code using comments in detail. After all this, I want to deploy this app (probably on playstore) so that I can play with my friends</w:t>
+      <w:pPr>
+        <w:pBdr>
+          <w:bottom w:val="double" w:sz="6" w:space="1" w:color="auto"/>
+        </w:pBdr>
+      </w:pPr>
+      <w:r>
+        <w:t xml:space="preserve">I am planning to make an app like </w:t>
+      </w:r>
+      <w:proofErr w:type="spellStart"/>
+      <w:r>
+        <w:t>kahoot</w:t>
+      </w:r>
+      <w:proofErr w:type="spellEnd"/>
+      <w:r>
+        <w:t xml:space="preserve"> where multiple users get in a custom room and play </w:t>
+      </w:r>
+      <w:proofErr w:type="gramStart"/>
+      <w:r>
+        <w:t>game</w:t>
+      </w:r>
+      <w:proofErr w:type="gramEnd"/>
+      <w:r>
+        <w:t xml:space="preserve"> based on MCQs. Now I want to add some extra features where the users who are playing the game must enter an interesting fact </w:t>
+      </w:r>
+      <w:proofErr w:type="gramStart"/>
+      <w:r>
+        <w:t>an</w:t>
+      </w:r>
+      <w:proofErr w:type="gramEnd"/>
+      <w:r>
+        <w:t xml:space="preserve"> about him. All the users must come with their original name. Now we have all the players with some interesting facts about each themselves After starting the game, each user will get </w:t>
+      </w:r>
+      <w:proofErr w:type="spellStart"/>
+      <w:r>
+        <w:t>mcqs</w:t>
+      </w:r>
+      <w:proofErr w:type="spellEnd"/>
+      <w:r>
+        <w:t xml:space="preserve"> in such format that the statement will be some interesting fact about one user and the options are some random </w:t>
+      </w:r>
+      <w:proofErr w:type="gramStart"/>
+      <w:r>
+        <w:t>user names</w:t>
+      </w:r>
+      <w:proofErr w:type="gramEnd"/>
+      <w:r>
+        <w:t xml:space="preserve">. Rest of the game will be of </w:t>
+      </w:r>
+      <w:proofErr w:type="spellStart"/>
+      <w:r>
+        <w:t>kahoot</w:t>
+      </w:r>
+      <w:proofErr w:type="spellEnd"/>
+      <w:r>
+        <w:t xml:space="preserve"> format. I want to build this game using Java </w:t>
+      </w:r>
+      <w:proofErr w:type="spellStart"/>
+      <w:r>
+        <w:t>springboot</w:t>
+      </w:r>
+      <w:proofErr w:type="spellEnd"/>
+      <w:r>
+        <w:t xml:space="preserve"> backend and </w:t>
+      </w:r>
+      <w:proofErr w:type="spellStart"/>
+      <w:r>
+        <w:t>kotlin</w:t>
+      </w:r>
+      <w:proofErr w:type="spellEnd"/>
+      <w:r>
+        <w:t xml:space="preserve"> jetpack compose frontend, I want it to be an interactive app with good color scheme and </w:t>
+      </w:r>
+      <w:proofErr w:type="spellStart"/>
+      <w:r>
+        <w:t>gui</w:t>
+      </w:r>
+      <w:proofErr w:type="spellEnd"/>
+      <w:r>
+        <w:t xml:space="preserve">. I want you to guide </w:t>
+      </w:r>
+      <w:proofErr w:type="gramStart"/>
+      <w:r>
+        <w:t>me</w:t>
+      </w:r>
+      <w:proofErr w:type="gramEnd"/>
+      <w:r>
+        <w:t xml:space="preserve"> how </w:t>
+      </w:r>
+      <w:proofErr w:type="gramStart"/>
+      <w:r>
+        <w:t>can I</w:t>
+      </w:r>
+      <w:proofErr w:type="gramEnd"/>
+      <w:r>
+        <w:t xml:space="preserve"> build this app from scratch. Also tell me whole of the procedure as </w:t>
+      </w:r>
+      <w:proofErr w:type="spellStart"/>
+      <w:proofErr w:type="gramStart"/>
+      <w:r>
+        <w:t>its</w:t>
+      </w:r>
+      <w:proofErr w:type="spellEnd"/>
+      <w:proofErr w:type="gramEnd"/>
+      <w:r>
+        <w:t xml:space="preserve"> my first project. If you are giving me </w:t>
+      </w:r>
+      <w:proofErr w:type="gramStart"/>
+      <w:r>
+        <w:t>code</w:t>
+      </w:r>
+      <w:proofErr w:type="gramEnd"/>
+      <w:r>
+        <w:t xml:space="preserve"> then explain each of the </w:t>
+      </w:r>
+      <w:proofErr w:type="gramStart"/>
+      <w:r>
+        <w:t>component</w:t>
+      </w:r>
+      <w:proofErr w:type="gramEnd"/>
+      <w:r>
+        <w:t xml:space="preserve"> of code using comments in detail. After all this, I want to deploy this app (probably on </w:t>
+      </w:r>
+      <w:proofErr w:type="spellStart"/>
+      <w:r>
+        <w:t>playstore</w:t>
+      </w:r>
+      <w:proofErr w:type="spellEnd"/>
+      <w:r>
+        <w:t>) so that I can play with my friends</w:t>
       </w:r>
     </w:p>
     <w:p>
       <w:r>
-        <w:t>S</w:t>
+        <w:t>Modify all the files as per the following requirements</w:t>
+      </w:r>
+      <w:r>
+        <w:t>, and write each file again with minimal comments</w:t>
+      </w:r>
+      <w:r>
+        <w:t>:</w:t>
+      </w:r>
+    </w:p>
+    <w:p>
+      <w:r>
+        <w:t>Give score with respect to time taken in model/Player</w:t>
+      </w:r>
+    </w:p>
+    <w:p>
+      <w:r>
+        <w:t>Host should also play the game</w:t>
+      </w:r>
+    </w:p>
+    <w:p>
+      <w:r>
+        <w:t>Limit the number of questions as per host will</w:t>
+      </w:r>
+    </w:p>
+    <w:p>
+      <w:r>
+        <w:t>Remove already asked questions</w:t>
+      </w:r>
+      <w:r>
+        <w:t xml:space="preserve"> and generate questions randomly</w:t>
+      </w:r>
+    </w:p>
+    <w:p>
+      <w:r>
+        <w:t>Option for host to start the game, without waiting for other players</w:t>
+      </w:r>
+    </w:p>
+    <w:p>
+      <w:r>
+        <w:t>Option for host to kick any player before starting the game</w:t>
+      </w:r>
+    </w:p>
+    <w:p>
+      <w:r>
+        <w:t>Allow host to adjust timer for each question</w:t>
+      </w:r>
+      <w:r>
+        <w:t>, add zero for the players who haven’t answered.</w:t>
+      </w:r>
+    </w:p>
+    <w:p>
+      <w:r>
+        <w:t>Assign same position to players If they have equal scores</w:t>
+      </w:r>
+    </w:p>
+    <w:p>
+      <w:r>
+        <w:t xml:space="preserve">Prevent duplicate </w:t>
+      </w:r>
+      <w:proofErr w:type="gramStart"/>
+      <w:r>
+        <w:t>entries</w:t>
+      </w:r>
+      <w:r>
+        <w:t>(</w:t>
+      </w:r>
+      <w:proofErr w:type="spellStart"/>
+      <w:proofErr w:type="gramEnd"/>
+      <w:r>
+        <w:t>players</w:t>
+      </w:r>
+      <w:proofErr w:type="spellEnd"/>
+      <w:r>
+        <w:t xml:space="preserve"> names)</w:t>
       </w:r>
     </w:p>
     <w:sectPr>
@@ -625,6 +825,7 @@
   <w:style w:type="character" w:default="1" w:styleId="DefaultParagraphFont">
     <w:name w:val="Default Paragraph Font"/>
     <w:uiPriority w:val="1"/>
+    <w:semiHidden/>
     <w:unhideWhenUsed/>
   </w:style>
   <w:style w:type="table" w:default="1" w:styleId="TableNormal">

</xml_diff>